<commit_message>
docs: sustentar la adaptacion del TAM al contexto clinico
Agrega Matemba et al. (2020) como antecedente de que el contexto de
salud modera las relaciones del TAM, y descarta explicitamente
TAM3+Warm-Glow y TAM3 en educacion como variantes fuera de dominio.

Co-Authored-By: Claude Sonnet 5 <noreply@anthropic.com>
</commit_message>
<xml_diff>
--- a/docs/docs/fundamento_instrumento_tam.docx
+++ b/docs/docs/fundamento_instrumento_tam.docx
@@ -539,6 +539,119 @@
       </w:r>
       <w:r>
         <w:t xml:space="preserve">trabajo híbrido en la industria de software, fuera del dominio.</w:t>
+      </w:r>
+    </w:p>
+    <w:p>
+      <w:pPr>
+        <w:pStyle w:val="Compact"/>
+        <w:numPr>
+          <w:ilvl w:val="0"/>
+          <w:numId w:val="1001"/>
+        </w:numPr>
+      </w:pPr>
+      <w:r>
+        <w:rPr>
+          <w:b/>
+          <w:bCs/>
+        </w:rPr>
+        <w:t xml:space="preserve">TAM3 + Warm-Glow</w:t>
+      </w:r>
+      <w:r>
+        <w:t xml:space="preserve">: añade el bienestar emocional de</w:t>
+      </w:r>
+      <w:r>
+        <w:t xml:space="preserve"> </w:t>
+      </w:r>
+      <w:r>
+        <w:t xml:space="preserve">“hacer el bien”</w:t>
+      </w:r>
+      <w:r>
+        <w:t xml:space="preserve"> </w:t>
+      </w:r>
+      <w:r>
+        <w:t xml:space="preserve">como antecedente de la</w:t>
+      </w:r>
+      <w:r>
+        <w:t xml:space="preserve"> </w:t>
+      </w:r>
+      <w:r>
+        <w:t xml:space="preserve">utilidad percibida; pensado para tecnología de consumo/filantropía, no para personal clínico</w:t>
+      </w:r>
+      <w:r>
+        <w:t xml:space="preserve"> </w:t>
+      </w:r>
+      <w:r>
+        <w:t xml:space="preserve">evaluando una herramienta de trabajo.</w:t>
+      </w:r>
+    </w:p>
+    <w:p>
+      <w:pPr>
+        <w:pStyle w:val="Compact"/>
+        <w:numPr>
+          <w:ilvl w:val="0"/>
+          <w:numId w:val="1001"/>
+        </w:numPr>
+      </w:pPr>
+      <w:r>
+        <w:rPr>
+          <w:b/>
+          <w:bCs/>
+        </w:rPr>
+        <w:t xml:space="preserve">TAM3 en contextos educativos</w:t>
+      </w:r>
+      <w:r>
+        <w:t xml:space="preserve"> </w:t>
+      </w:r>
+      <w:r>
+        <w:t xml:space="preserve">(meta-análisis con 12 estudios, n=3874): encuentra que TAM3 puede</w:t>
+      </w:r>
+      <w:r>
+        <w:t xml:space="preserve"> </w:t>
+      </w:r>
+      <w:r>
+        <w:t xml:space="preserve">no ajustar bien fuera de su dominio organizacional original, lo que refuerza no forzarlo aquí.</w:t>
+      </w:r>
+    </w:p>
+    <w:p>
+      <w:pPr>
+        <w:pStyle w:val="FirstParagraph"/>
+      </w:pPr>
+      <w:r>
+        <w:t xml:space="preserve">Matemba et al. (2020), tras revisar 166 estudios sobre TAM, plantean como hipótesis que el estado de</w:t>
+      </w:r>
+      <w:r>
+        <w:t xml:space="preserve"> </w:t>
+      </w:r>
+      <w:r>
+        <w:t xml:space="preserve">salud modera la fuerza de las relaciones entre sus constructos. No se aplica un modelo distinto por</w:t>
+      </w:r>
+      <w:r>
+        <w:t xml:space="preserve"> </w:t>
+      </w:r>
+      <w:r>
+        <w:t xml:space="preserve">eso, pero sí respalda</w:t>
+      </w:r>
+      <w:r>
+        <w:t xml:space="preserve"> </w:t>
+      </w:r>
+      <w:r>
+        <w:rPr>
+          <w:b/>
+          <w:bCs/>
+        </w:rPr>
+        <w:t xml:space="preserve">adaptar los enunciados al contexto sanitario</w:t>
+      </w:r>
+      <w:r>
+        <w:t xml:space="preserve"> </w:t>
+      </w:r>
+      <w:r>
+        <w:t xml:space="preserve">en vez de traducir los ítems</w:t>
+      </w:r>
+      <w:r>
+        <w:t xml:space="preserve"> </w:t>
+      </w:r>
+      <w:r>
+        <w:t xml:space="preserve">originales de forma literal.</w:t>
       </w:r>
     </w:p>
     <w:bookmarkEnd w:id="9"/>

</xml_diff>

<commit_message>
fix: corregir anchos de tabla mal calculados en fundamento_instrumento_tam
Los separadores markdown no coincidian en numero de columnas con el
encabezado, lo que hacia que pandoc comprimiera o partiera el texto
de varias celdas.

Co-Authored-By: Claude Sonnet 5 <noreply@anthropic.com>
</commit_message>
<xml_diff>
--- a/docs/docs/fundamento_instrumento_tam.docx
+++ b/docs/docs/fundamento_instrumento_tam.docx
@@ -63,10 +63,9 @@
         <w:tblLook w:firstRow="1" w:lastRow="0" w:firstColumn="0" w:lastColumn="0" w:noHBand="0" w:noVBand="0" w:val="0020"/>
       </w:tblPr>
       <w:tblGrid>
-        <w:gridCol w:w="1980"/>
-        <w:gridCol w:w="1980"/>
-        <w:gridCol w:w="1980"/>
-        <w:gridCol w:w="1980"/>
+        <w:gridCol w:w="316"/>
+        <w:gridCol w:w="7286"/>
+        <w:gridCol w:w="316"/>
       </w:tblGrid>
       <w:tr>
         <w:trPr>
@@ -105,14 +104,6 @@
             </w:r>
           </w:p>
         </w:tc>
-        <w:tc>
-          <w:tcPr/>
-          <w:p>
-            <w:pPr>
-              <w:pStyle w:val="Compact"/>
-            </w:pPr>
-          </w:p>
-        </w:tc>
       </w:tr>
       <w:tr>
         <w:tc>
@@ -148,14 +139,6 @@
             </w:r>
           </w:p>
         </w:tc>
-        <w:tc>
-          <w:tcPr/>
-          <w:p>
-            <w:pPr>
-              <w:pStyle w:val="Compact"/>
-            </w:pPr>
-          </w:p>
-        </w:tc>
       </w:tr>
       <w:tr>
         <w:tc>
@@ -189,14 +172,6 @@
             <w:r>
               <w:t xml:space="preserve">TAM2</w:t>
             </w:r>
-          </w:p>
-        </w:tc>
-        <w:tc>
-          <w:tcPr/>
-          <w:p>
-            <w:pPr>
-              <w:pStyle w:val="Compact"/>
-            </w:pPr>
           </w:p>
         </w:tc>
       </w:tr>
@@ -251,14 +226,6 @@
             </w:r>
           </w:p>
         </w:tc>
-        <w:tc>
-          <w:tcPr/>
-          <w:p>
-            <w:pPr>
-              <w:pStyle w:val="Compact"/>
-            </w:pPr>
-          </w:p>
-        </w:tc>
       </w:tr>
       <w:tr>
         <w:tc>
@@ -298,14 +265,6 @@
             </w:r>
           </w:p>
         </w:tc>
-        <w:tc>
-          <w:tcPr/>
-          <w:p>
-            <w:pPr>
-              <w:pStyle w:val="Compact"/>
-            </w:pPr>
-          </w:p>
-        </w:tc>
       </w:tr>
       <w:tr>
         <w:tc>
@@ -350,14 +309,6 @@
               </w:rPr>
               <w:t xml:space="preserve">TAM2</w:t>
             </w:r>
-          </w:p>
-        </w:tc>
-        <w:tc>
-          <w:tcPr/>
-          <w:p>
-            <w:pPr>
-              <w:pStyle w:val="Compact"/>
-            </w:pPr>
           </w:p>
         </w:tc>
       </w:tr>
@@ -672,9 +623,10 @@
         <w:tblLook w:firstRow="1" w:lastRow="0" w:firstColumn="0" w:lastColumn="0" w:noHBand="0" w:noVBand="0" w:val="0020"/>
       </w:tblPr>
       <w:tblGrid>
-        <w:gridCol w:w="2640"/>
-        <w:gridCol w:w="2640"/>
-        <w:gridCol w:w="2640"/>
+        <w:gridCol w:w="6336"/>
+        <w:gridCol w:w="339"/>
+        <w:gridCol w:w="339"/>
+        <w:gridCol w:w="905"/>
       </w:tblGrid>
       <w:tr>
         <w:trPr>
@@ -713,6 +665,17 @@
             </w:r>
           </w:p>
         </w:tc>
+        <w:tc>
+          <w:tcPr/>
+          <w:p>
+            <w:pPr>
+              <w:pStyle w:val="Compact"/>
+            </w:pPr>
+            <w:r>
+              <w:t xml:space="preserve">Ítems</w:t>
+            </w:r>
+          </w:p>
+        </w:tc>
       </w:tr>
       <w:tr>
         <w:tc>
@@ -758,6 +721,17 @@
             </w:r>
           </w:p>
         </w:tc>
+        <w:tc>
+          <w:tcPr/>
+          <w:p>
+            <w:pPr>
+              <w:pStyle w:val="Compact"/>
+            </w:pPr>
+            <w:r>
+              <w:t xml:space="preserve">R1–R3</w:t>
+            </w:r>
+          </w:p>
+        </w:tc>
       </w:tr>
       <w:tr>
         <w:tc>
@@ -803,6 +777,17 @@
             </w:r>
           </w:p>
         </w:tc>
+        <w:tc>
+          <w:tcPr/>
+          <w:p>
+            <w:pPr>
+              <w:pStyle w:val="Compact"/>
+            </w:pPr>
+            <w:r>
+              <w:t xml:space="preserve">C1–C3</w:t>
+            </w:r>
+          </w:p>
+        </w:tc>
       </w:tr>
       <w:tr>
         <w:tc>
@@ -848,6 +833,17 @@
             </w:r>
           </w:p>
         </w:tc>
+        <w:tc>
+          <w:tcPr/>
+          <w:p>
+            <w:pPr>
+              <w:pStyle w:val="Compact"/>
+            </w:pPr>
+            <w:r>
+              <w:t xml:space="preserve">D1–D2</w:t>
+            </w:r>
+          </w:p>
+        </w:tc>
       </w:tr>
       <w:tr>
         <w:tc>
@@ -893,6 +889,17 @@
             </w:r>
           </w:p>
         </w:tc>
+        <w:tc>
+          <w:tcPr/>
+          <w:p>
+            <w:pPr>
+              <w:pStyle w:val="Compact"/>
+            </w:pPr>
+            <w:r>
+              <w:t xml:space="preserve">U1–U4</w:t>
+            </w:r>
+          </w:p>
+        </w:tc>
       </w:tr>
       <w:tr>
         <w:tc>
@@ -938,6 +945,17 @@
             </w:r>
           </w:p>
         </w:tc>
+        <w:tc>
+          <w:tcPr/>
+          <w:p>
+            <w:pPr>
+              <w:pStyle w:val="Compact"/>
+            </w:pPr>
+            <w:r>
+              <w:t xml:space="preserve">F1–F4</w:t>
+            </w:r>
+          </w:p>
+        </w:tc>
       </w:tr>
       <w:tr>
         <w:tc>
@@ -983,6 +1001,17 @@
             </w:r>
           </w:p>
         </w:tc>
+        <w:tc>
+          <w:tcPr/>
+          <w:p>
+            <w:pPr>
+              <w:pStyle w:val="Compact"/>
+            </w:pPr>
+            <w:r>
+              <w:t xml:space="preserve">K1–K3</w:t>
+            </w:r>
+          </w:p>
+        </w:tc>
       </w:tr>
       <w:tr>
         <w:tc>
@@ -1028,6 +1057,17 @@
             </w:r>
           </w:p>
         </w:tc>
+        <w:tc>
+          <w:tcPr/>
+          <w:p>
+            <w:pPr>
+              <w:pStyle w:val="Compact"/>
+            </w:pPr>
+            <w:r>
+              <w:t xml:space="preserve">S1–S2</w:t>
+            </w:r>
+          </w:p>
+        </w:tc>
       </w:tr>
       <w:tr>
         <w:tc>
@@ -1070,6 +1110,17 @@
             </w:pPr>
             <w:r>
               <w:t xml:space="preserve">X</w:t>
+            </w:r>
+          </w:p>
+        </w:tc>
+        <w:tc>
+          <w:tcPr/>
+          <w:p>
+            <w:pPr>
+              <w:pStyle w:val="Compact"/>
+            </w:pPr>
+            <w:r>
+              <w:t xml:space="preserve">I1–I3</w:t>
             </w:r>
           </w:p>
         </w:tc>

</xml_diff>

<commit_message>
docs: align the TAM2 instrument with the published scales
Items are now traced to Venkatesh & Davis (2000, Appendix 1), trimmed
to 19 so no construct repeats another, and the methodology gains a
subsection listing each construct and its source model. The panel size
in the rationale is corrected from six to five.

Co-Authored-By: Claude Opus 5.5 <noreply@anthropic.com>
</commit_message>
<xml_diff>
--- a/docs/docs/fundamento_instrumento_tam.docx
+++ b/docs/docs/fundamento_instrumento_tam.docx
@@ -2,7 +2,7 @@
 <file path=word/document.xml><?xml version="1.0" encoding="utf-8"?>
 <w:document xmlns:w="http://schemas.openxmlformats.org/wordprocessingml/2006/main" xmlns:m="http://schemas.openxmlformats.org/officeDocument/2006/math" xmlns:r="http://schemas.openxmlformats.org/officeDocument/2006/relationships" xmlns:o="urn:schemas-microsoft-com:office:office" xmlns:v="urn:schemas-microsoft-com:vml" xmlns:w10="urn:schemas-microsoft-com:office:word" xmlns:a="http://schemas.openxmlformats.org/drawingml/2006/main" xmlns:pic="http://schemas.openxmlformats.org/drawingml/2006/picture" xmlns:wp="http://schemas.openxmlformats.org/drawingml/2006/wordprocessingDrawing">
   <w:body>
-    <w:bookmarkStart w:id="13" w:name="X944af8d387219e6b81c96ae875fdec072ac079b"/>
+    <w:bookmarkStart w:id="15" w:name="X944af8d387219e6b81c96ae875fdec072ac079b"/>
     <w:p>
       <w:pPr>
         <w:pStyle w:val="Heading1"/>
@@ -292,7 +292,7 @@
               <w:t xml:space="preserve">Intermedia</w:t>
             </w:r>
             <w:r>
-              <w:t xml:space="preserve">: un panel de seis especialistas no sostiene un modelo de alta complejidad</w:t>
+              <w:t xml:space="preserve">: un panel de cinco especialistas no sostiene un modelo de alta complejidad</w:t>
             </w:r>
           </w:p>
         </w:tc>
@@ -606,7 +606,7 @@
       </w:r>
     </w:p>
     <w:bookmarkEnd w:id="9"/>
-    <w:bookmarkStart w:id="10" w:name="X6ed25b42528641cae165b23a3d9f1c27b9bab88"/>
+    <w:bookmarkStart w:id="12" w:name="X6ed25b42528641cae165b23a3d9f1c27b9bab88"/>
     <w:p>
       <w:pPr>
         <w:pStyle w:val="Heading2"/>
@@ -623,10 +623,11 @@
         <w:tblLook w:firstRow="1" w:lastRow="0" w:firstColumn="0" w:lastColumn="0" w:noHBand="0" w:noVBand="0" w:val="0020"/>
       </w:tblPr>
       <w:tblGrid>
-        <w:gridCol w:w="6336"/>
-        <w:gridCol w:w="339"/>
-        <w:gridCol w:w="339"/>
-        <w:gridCol w:w="905"/>
+        <w:gridCol w:w="5993"/>
+        <w:gridCol w:w="321"/>
+        <w:gridCol w:w="321"/>
+        <w:gridCol w:w="321"/>
+        <w:gridCol w:w="963"/>
       </w:tblGrid>
       <w:tr>
         <w:trPr>
@@ -672,7 +673,18 @@
               <w:pStyle w:val="Compact"/>
             </w:pPr>
             <w:r>
-              <w:t xml:space="preserve">Ítems</w:t>
+              <w:t xml:space="preserve">Ítems en la fuente</w:t>
+            </w:r>
+          </w:p>
+        </w:tc>
+        <w:tc>
+          <w:tcPr/>
+          <w:p>
+            <w:pPr>
+              <w:pStyle w:val="Compact"/>
+            </w:pPr>
+            <w:r>
+              <w:t xml:space="preserve">Ítems en la ficha</w:t>
             </w:r>
           </w:p>
         </w:tc>
@@ -728,7 +740,18 @@
               <w:pStyle w:val="Compact"/>
             </w:pPr>
             <w:r>
-              <w:t xml:space="preserve">R1–R3</w:t>
+              <w:t xml:space="preserve">2</w:t>
+            </w:r>
+          </w:p>
+        </w:tc>
+        <w:tc>
+          <w:tcPr/>
+          <w:p>
+            <w:pPr>
+              <w:pStyle w:val="Compact"/>
+            </w:pPr>
+            <w:r>
+              <w:t xml:space="preserve">R1–R2</w:t>
             </w:r>
           </w:p>
         </w:tc>
@@ -784,7 +807,18 @@
               <w:pStyle w:val="Compact"/>
             </w:pPr>
             <w:r>
-              <w:t xml:space="preserve">C1–C3</w:t>
+              <w:t xml:space="preserve">2</w:t>
+            </w:r>
+          </w:p>
+        </w:tc>
+        <w:tc>
+          <w:tcPr/>
+          <w:p>
+            <w:pPr>
+              <w:pStyle w:val="Compact"/>
+            </w:pPr>
+            <w:r>
+              <w:t xml:space="preserve">C1–C2</w:t>
             </w:r>
           </w:p>
         </w:tc>
@@ -840,6 +874,17 @@
               <w:pStyle w:val="Compact"/>
             </w:pPr>
             <w:r>
+              <w:t xml:space="preserve">4</w:t>
+            </w:r>
+          </w:p>
+        </w:tc>
+        <w:tc>
+          <w:tcPr/>
+          <w:p>
+            <w:pPr>
+              <w:pStyle w:val="Compact"/>
+            </w:pPr>
+            <w:r>
               <w:t xml:space="preserve">D1–D2</w:t>
             </w:r>
           </w:p>
@@ -896,7 +941,18 @@
               <w:pStyle w:val="Compact"/>
             </w:pPr>
             <w:r>
-              <w:t xml:space="preserve">U1–U4</w:t>
+              <w:t xml:space="preserve">4</w:t>
+            </w:r>
+          </w:p>
+        </w:tc>
+        <w:tc>
+          <w:tcPr/>
+          <w:p>
+            <w:pPr>
+              <w:pStyle w:val="Compact"/>
+            </w:pPr>
+            <w:r>
+              <w:t xml:space="preserve">U1–U3</w:t>
             </w:r>
           </w:p>
         </w:tc>
@@ -952,7 +1008,18 @@
               <w:pStyle w:val="Compact"/>
             </w:pPr>
             <w:r>
-              <w:t xml:space="preserve">F1–F4</w:t>
+              <w:t xml:space="preserve">4</w:t>
+            </w:r>
+          </w:p>
+        </w:tc>
+        <w:tc>
+          <w:tcPr/>
+          <w:p>
+            <w:pPr>
+              <w:pStyle w:val="Compact"/>
+            </w:pPr>
+            <w:r>
+              <w:t xml:space="preserve">F1–F3</w:t>
             </w:r>
           </w:p>
         </w:tc>
@@ -1008,6 +1075,17 @@
               <w:pStyle w:val="Compact"/>
             </w:pPr>
             <w:r>
+              <w:t xml:space="preserve">—</w:t>
+            </w:r>
+          </w:p>
+        </w:tc>
+        <w:tc>
+          <w:tcPr/>
+          <w:p>
+            <w:pPr>
+              <w:pStyle w:val="Compact"/>
+            </w:pPr>
+            <w:r>
               <w:t xml:space="preserve">K1–K3</w:t>
             </w:r>
           </w:p>
@@ -1064,6 +1142,17 @@
               <w:pStyle w:val="Compact"/>
             </w:pPr>
             <w:r>
+              <w:t xml:space="preserve">2</w:t>
+            </w:r>
+          </w:p>
+        </w:tc>
+        <w:tc>
+          <w:tcPr/>
+          <w:p>
+            <w:pPr>
+              <w:pStyle w:val="Compact"/>
+            </w:pPr>
+            <w:r>
               <w:t xml:space="preserve">S1–S2</w:t>
             </w:r>
           </w:p>
@@ -1120,7 +1209,18 @@
               <w:pStyle w:val="Compact"/>
             </w:pPr>
             <w:r>
-              <w:t xml:space="preserve">I1–I3</w:t>
+              <w:t xml:space="preserve">2</w:t>
+            </w:r>
+          </w:p>
+        </w:tc>
+        <w:tc>
+          <w:tcPr/>
+          <w:p>
+            <w:pPr>
+              <w:pStyle w:val="Compact"/>
+            </w:pPr>
+            <w:r>
+              <w:t xml:space="preserve">I1–I2</w:t>
             </w:r>
           </w:p>
         </w:tc>
@@ -1135,7 +1235,7 @@
           <w:b/>
           <w:bCs/>
         </w:rPr>
-        <w:t xml:space="preserve">24 ítems</w:t>
+        <w:t xml:space="preserve">19 ítems</w:t>
       </w:r>
       <w:r>
         <w:t xml:space="preserve"> </w:t>
@@ -1144,6 +1244,702 @@
         <w:t xml:space="preserve">en escala de 1 a 5, más una valoración global de 1 a 10 y cuatro preguntas abiertas.</w:t>
       </w:r>
     </w:p>
+    <w:bookmarkStart w:id="10" w:name="por-qué-hay-menos-ítems-que-en-la-fuente"/>
+    <w:p>
+      <w:pPr>
+        <w:pStyle w:val="Heading3"/>
+      </w:pPr>
+      <w:r>
+        <w:t xml:space="preserve">Por qué hay menos ítems que en la fuente</w:t>
+      </w:r>
+    </w:p>
+    <w:p>
+      <w:pPr>
+        <w:pStyle w:val="FirstParagraph"/>
+      </w:pPr>
+      <w:r>
+        <w:t xml:space="preserve">Las escalas de Venkatesh y Davis (2000, Apéndice 1) repiten a propósito la misma idea con otras</w:t>
+      </w:r>
+      <w:r>
+        <w:t xml:space="preserve"> </w:t>
+      </w:r>
+      <w:r>
+        <w:t xml:space="preserve">palabras dentro de cada constructo (por ejemplo,</w:t>
+      </w:r>
+      <w:r>
+        <w:t xml:space="preserve"> </w:t>
+      </w:r>
+      <w:r>
+        <w:rPr>
+          <w:i/>
+          <w:iCs/>
+        </w:rPr>
+        <w:t xml:space="preserve">“usage of the system is important”</w:t>
+      </w:r>
+      <w:r>
+        <w:t xml:space="preserve"> </w:t>
+      </w:r>
+      <w:r>
+        <w:t xml:space="preserve">y</w:t>
+      </w:r>
+      <w:r>
+        <w:t xml:space="preserve"> </w:t>
+      </w:r>
+      <w:r>
+        <w:rPr>
+          <w:i/>
+          <w:iCs/>
+        </w:rPr>
+        <w:t xml:space="preserve">“… is</w:t>
+      </w:r>
+      <w:r>
+        <w:rPr>
+          <w:i/>
+          <w:iCs/>
+        </w:rPr>
+        <w:t xml:space="preserve"> </w:t>
+      </w:r>
+      <w:r>
+        <w:rPr>
+          <w:i/>
+          <w:iCs/>
+        </w:rPr>
+        <w:t xml:space="preserve">relevant”</w:t>
+      </w:r>
+      <w:r>
+        <w:t xml:space="preserve">), porque así estiman la consistencia interna con el alfa de Cronbach. Con cinco evaluadores</w:t>
+      </w:r>
+      <w:r>
+        <w:t xml:space="preserve"> </w:t>
+      </w:r>
+      <w:r>
+        <w:t xml:space="preserve">ese cálculo no se hace, de modo que esa redundancia no aporta información y alarga la ficha. Se</w:t>
+      </w:r>
+      <w:r>
+        <w:t xml:space="preserve"> </w:t>
+      </w:r>
+      <w:r>
+        <w:t xml:space="preserve">conservó en cada constructo solo lo que tiene contenido distinto, sin bajar de dos ítems: los propios</w:t>
+      </w:r>
+      <w:r>
+        <w:t xml:space="preserve"> </w:t>
+      </w:r>
+      <w:r>
+        <w:t xml:space="preserve">autores usan dos ítems en cuatro escalas y declaran alfas superiores a 0.80 (sección</w:t>
+      </w:r>
+      <w:r>
+        <w:t xml:space="preserve"> </w:t>
+      </w:r>
+      <w:r>
+        <w:rPr>
+          <w:i/>
+          <w:iCs/>
+        </w:rPr>
+        <w:t xml:space="preserve">Limitations</w:t>
+      </w:r>
+      <w:r>
+        <w:t xml:space="preserve">).</w:t>
+      </w:r>
+    </w:p>
+    <w:p>
+      <w:pPr>
+        <w:pStyle w:val="BodyText"/>
+      </w:pPr>
+      <w:r>
+        <w:t xml:space="preserve">Se eliminaron además los ítems que repetían el contenido de</w:t>
+      </w:r>
+      <w:r>
+        <w:t xml:space="preserve"> </w:t>
+      </w:r>
+      <w:r>
+        <w:rPr>
+          <w:b/>
+          <w:bCs/>
+        </w:rPr>
+        <w:t xml:space="preserve">otro</w:t>
+      </w:r>
+      <w:r>
+        <w:t xml:space="preserve"> </w:t>
+      </w:r>
+      <w:r>
+        <w:t xml:space="preserve">constructo: priorizar aparecía en</w:t>
+      </w:r>
+      <w:r>
+        <w:t xml:space="preserve"> </w:t>
+      </w:r>
+      <w:r>
+        <w:t xml:space="preserve">calidad y en utilidad, y comprender el resultado aparecía en facilidad de uso y en demostrabilidad.</w:t>
+      </w:r>
+    </w:p>
+    <w:p>
+      <w:pPr>
+        <w:pStyle w:val="BodyText"/>
+      </w:pPr>
+      <w:r>
+        <w:t xml:space="preserve">La escala original es de 7 puntos; la ficha usa 5, adaptación habitual que se declara en la</w:t>
+      </w:r>
+      <w:r>
+        <w:t xml:space="preserve"> </w:t>
+      </w:r>
+      <w:r>
+        <w:t xml:space="preserve">metodología. Los autores ajustaron la redacción de sus ítems con un grupo focal de cinco profesionales,</w:t>
+      </w:r>
+      <w:r>
+        <w:t xml:space="preserve"> </w:t>
+      </w:r>
+      <w:r>
+        <w:t xml:space="preserve">procedimiento equivalente al de este panel.</w:t>
+      </w:r>
+    </w:p>
+    <w:bookmarkEnd w:id="10"/>
+    <w:bookmarkStart w:id="11" w:name="de-qué-ítem-original-sale-cada-uno"/>
+    <w:p>
+      <w:pPr>
+        <w:pStyle w:val="Heading3"/>
+      </w:pPr>
+      <w:r>
+        <w:t xml:space="preserve">De qué ítem original sale cada uno</w:t>
+      </w:r>
+    </w:p>
+    <w:tbl>
+      <w:tblPr>
+        <w:tblStyle w:val="Table"/>
+        <w:tblW w:type="pct" w:w="5000"/>
+        <w:tblLayout w:type="fixed"/>
+        <w:tblLook w:firstRow="1" w:lastRow="0" w:firstColumn="0" w:lastColumn="0" w:noHBand="0" w:noVBand="0" w:val="0020"/>
+      </w:tblPr>
+      <w:tblGrid>
+        <w:gridCol w:w="495"/>
+        <w:gridCol w:w="7425"/>
+      </w:tblGrid>
+      <w:tr>
+        <w:trPr>
+          <w:tblHeader w:val="on"/>
+        </w:trPr>
+        <w:tc>
+          <w:tcPr/>
+          <w:p>
+            <w:pPr>
+              <w:pStyle w:val="Compact"/>
+              <w:jc w:val="center"/>
+            </w:pPr>
+            <w:r>
+              <w:t xml:space="preserve">Ítem</w:t>
+            </w:r>
+          </w:p>
+        </w:tc>
+        <w:tc>
+          <w:tcPr/>
+          <w:p>
+            <w:pPr>
+              <w:pStyle w:val="Compact"/>
+            </w:pPr>
+            <w:r>
+              <w:t xml:space="preserve">Ítem original (Venkatesh y Davis, 2000, salvo indicación)</w:t>
+            </w:r>
+          </w:p>
+        </w:tc>
+      </w:tr>
+      <w:tr>
+        <w:tc>
+          <w:tcPr/>
+          <w:p>
+            <w:pPr>
+              <w:pStyle w:val="Compact"/>
+              <w:jc w:val="center"/>
+            </w:pPr>
+            <w:r>
+              <w:t xml:space="preserve">R1</w:t>
+            </w:r>
+          </w:p>
+        </w:tc>
+        <w:tc>
+          <w:tcPr/>
+          <w:p>
+            <w:pPr>
+              <w:pStyle w:val="Compact"/>
+            </w:pPr>
+            <w:r>
+              <w:rPr>
+                <w:i/>
+                <w:iCs/>
+              </w:rPr>
+              <w:t xml:space="preserve">In my job, usage of the system is important.</w:t>
+            </w:r>
+          </w:p>
+        </w:tc>
+      </w:tr>
+      <w:tr>
+        <w:tc>
+          <w:tcPr/>
+          <w:p>
+            <w:pPr>
+              <w:pStyle w:val="Compact"/>
+              <w:jc w:val="center"/>
+            </w:pPr>
+            <w:r>
+              <w:t xml:space="preserve">R2</w:t>
+            </w:r>
+          </w:p>
+        </w:tc>
+        <w:tc>
+          <w:tcPr/>
+          <w:p>
+            <w:pPr>
+              <w:pStyle w:val="Compact"/>
+            </w:pPr>
+            <w:r>
+              <w:rPr>
+                <w:i/>
+                <w:iCs/>
+              </w:rPr>
+              <w:t xml:space="preserve">In my job, usage of the system is relevant.</w:t>
+            </w:r>
+          </w:p>
+        </w:tc>
+      </w:tr>
+      <w:tr>
+        <w:tc>
+          <w:tcPr/>
+          <w:p>
+            <w:pPr>
+              <w:pStyle w:val="Compact"/>
+              <w:jc w:val="center"/>
+            </w:pPr>
+            <w:r>
+              <w:t xml:space="preserve">C1</w:t>
+            </w:r>
+          </w:p>
+        </w:tc>
+        <w:tc>
+          <w:tcPr/>
+          <w:p>
+            <w:pPr>
+              <w:pStyle w:val="Compact"/>
+            </w:pPr>
+            <w:r>
+              <w:rPr>
+                <w:i/>
+                <w:iCs/>
+              </w:rPr>
+              <w:t xml:space="preserve">I have no problem with the quality of the system’s output.</w:t>
+            </w:r>
+          </w:p>
+        </w:tc>
+      </w:tr>
+      <w:tr>
+        <w:tc>
+          <w:tcPr/>
+          <w:p>
+            <w:pPr>
+              <w:pStyle w:val="Compact"/>
+              <w:jc w:val="center"/>
+            </w:pPr>
+            <w:r>
+              <w:t xml:space="preserve">C2</w:t>
+            </w:r>
+          </w:p>
+        </w:tc>
+        <w:tc>
+          <w:tcPr/>
+          <w:p>
+            <w:pPr>
+              <w:pStyle w:val="Compact"/>
+            </w:pPr>
+            <w:r>
+              <w:rPr>
+                <w:i/>
+                <w:iCs/>
+              </w:rPr>
+              <w:t xml:space="preserve">The quality of the output I get from the system is high.</w:t>
+            </w:r>
+          </w:p>
+        </w:tc>
+      </w:tr>
+      <w:tr>
+        <w:tc>
+          <w:tcPr/>
+          <w:p>
+            <w:pPr>
+              <w:pStyle w:val="Compact"/>
+              <w:jc w:val="center"/>
+            </w:pPr>
+            <w:r>
+              <w:t xml:space="preserve">D1</w:t>
+            </w:r>
+          </w:p>
+        </w:tc>
+        <w:tc>
+          <w:tcPr/>
+          <w:p>
+            <w:pPr>
+              <w:pStyle w:val="Compact"/>
+            </w:pPr>
+            <w:r>
+              <w:rPr>
+                <w:i/>
+                <w:iCs/>
+              </w:rPr>
+              <w:t xml:space="preserve">The results of using the system are apparent to me.</w:t>
+            </w:r>
+            <w:r>
+              <w:t xml:space="preserve"> </w:t>
+            </w:r>
+            <w:r>
+              <w:t xml:space="preserve">Adaptado hacia la explicación del modelo (valores SHAP)</w:t>
+            </w:r>
+          </w:p>
+        </w:tc>
+      </w:tr>
+      <w:tr>
+        <w:tc>
+          <w:tcPr/>
+          <w:p>
+            <w:pPr>
+              <w:pStyle w:val="Compact"/>
+              <w:jc w:val="center"/>
+            </w:pPr>
+            <w:r>
+              <w:t xml:space="preserve">D2</w:t>
+            </w:r>
+          </w:p>
+        </w:tc>
+        <w:tc>
+          <w:tcPr/>
+          <w:p>
+            <w:pPr>
+              <w:pStyle w:val="Compact"/>
+            </w:pPr>
+            <w:r>
+              <w:rPr>
+                <w:i/>
+                <w:iCs/>
+              </w:rPr>
+              <w:t xml:space="preserve">I have no difficulty telling others about the results of using the system.</w:t>
+            </w:r>
+          </w:p>
+        </w:tc>
+      </w:tr>
+      <w:tr>
+        <w:tc>
+          <w:tcPr/>
+          <w:p>
+            <w:pPr>
+              <w:pStyle w:val="Compact"/>
+              <w:jc w:val="center"/>
+            </w:pPr>
+            <w:r>
+              <w:t xml:space="preserve">U1</w:t>
+            </w:r>
+          </w:p>
+        </w:tc>
+        <w:tc>
+          <w:tcPr/>
+          <w:p>
+            <w:pPr>
+              <w:pStyle w:val="Compact"/>
+            </w:pPr>
+            <w:r>
+              <w:rPr>
+                <w:i/>
+                <w:iCs/>
+              </w:rPr>
+              <w:t xml:space="preserve">Using the system improves my performance in my job.</w:t>
+            </w:r>
+          </w:p>
+        </w:tc>
+      </w:tr>
+      <w:tr>
+        <w:tc>
+          <w:tcPr/>
+          <w:p>
+            <w:pPr>
+              <w:pStyle w:val="Compact"/>
+              <w:jc w:val="center"/>
+            </w:pPr>
+            <w:r>
+              <w:t xml:space="preserve">U2</w:t>
+            </w:r>
+          </w:p>
+        </w:tc>
+        <w:tc>
+          <w:tcPr/>
+          <w:p>
+            <w:pPr>
+              <w:pStyle w:val="Compact"/>
+            </w:pPr>
+            <w:r>
+              <w:rPr>
+                <w:i/>
+                <w:iCs/>
+              </w:rPr>
+              <w:t xml:space="preserve">Using the system in my job increases my productivity.</w:t>
+            </w:r>
+          </w:p>
+        </w:tc>
+      </w:tr>
+      <w:tr>
+        <w:tc>
+          <w:tcPr/>
+          <w:p>
+            <w:pPr>
+              <w:pStyle w:val="Compact"/>
+              <w:jc w:val="center"/>
+            </w:pPr>
+            <w:r>
+              <w:t xml:space="preserve">U3</w:t>
+            </w:r>
+          </w:p>
+        </w:tc>
+        <w:tc>
+          <w:tcPr/>
+          <w:p>
+            <w:pPr>
+              <w:pStyle w:val="Compact"/>
+            </w:pPr>
+            <w:r>
+              <w:rPr>
+                <w:i/>
+                <w:iCs/>
+              </w:rPr>
+              <w:t xml:space="preserve">Using the system enhances my effectiveness in my job.</w:t>
+            </w:r>
+          </w:p>
+        </w:tc>
+      </w:tr>
+      <w:tr>
+        <w:tc>
+          <w:tcPr/>
+          <w:p>
+            <w:pPr>
+              <w:pStyle w:val="Compact"/>
+              <w:jc w:val="center"/>
+            </w:pPr>
+            <w:r>
+              <w:t xml:space="preserve">F1</w:t>
+            </w:r>
+          </w:p>
+        </w:tc>
+        <w:tc>
+          <w:tcPr/>
+          <w:p>
+            <w:pPr>
+              <w:pStyle w:val="Compact"/>
+            </w:pPr>
+            <w:r>
+              <w:rPr>
+                <w:i/>
+                <w:iCs/>
+              </w:rPr>
+              <w:t xml:space="preserve">I find it easy to get the system to do what I want it to do.</w:t>
+            </w:r>
+          </w:p>
+        </w:tc>
+      </w:tr>
+      <w:tr>
+        <w:tc>
+          <w:tcPr/>
+          <w:p>
+            <w:pPr>
+              <w:pStyle w:val="Compact"/>
+              <w:jc w:val="center"/>
+            </w:pPr>
+            <w:r>
+              <w:t xml:space="preserve">F2</w:t>
+            </w:r>
+          </w:p>
+        </w:tc>
+        <w:tc>
+          <w:tcPr/>
+          <w:p>
+            <w:pPr>
+              <w:pStyle w:val="Compact"/>
+            </w:pPr>
+            <w:r>
+              <w:rPr>
+                <w:i/>
+                <w:iCs/>
+              </w:rPr>
+              <w:t xml:space="preserve">My interaction with the system is clear and understandable.</w:t>
+            </w:r>
+          </w:p>
+        </w:tc>
+      </w:tr>
+      <w:tr>
+        <w:tc>
+          <w:tcPr/>
+          <w:p>
+            <w:pPr>
+              <w:pStyle w:val="Compact"/>
+              <w:jc w:val="center"/>
+            </w:pPr>
+            <w:r>
+              <w:t xml:space="preserve">F3</w:t>
+            </w:r>
+          </w:p>
+        </w:tc>
+        <w:tc>
+          <w:tcPr/>
+          <w:p>
+            <w:pPr>
+              <w:pStyle w:val="Compact"/>
+            </w:pPr>
+            <w:r>
+              <w:t xml:space="preserve">Facilidad de aprendizaje, de Davis (1989); no figura en el apéndice de TAM2</w:t>
+            </w:r>
+          </w:p>
+        </w:tc>
+      </w:tr>
+      <w:tr>
+        <w:tc>
+          <w:tcPr/>
+          <w:p>
+            <w:pPr>
+              <w:pStyle w:val="Compact"/>
+              <w:jc w:val="center"/>
+            </w:pPr>
+            <w:r>
+              <w:t xml:space="preserve">K1–K3</w:t>
+            </w:r>
+          </w:p>
+        </w:tc>
+        <w:tc>
+          <w:tcPr/>
+          <w:p>
+            <w:pPr>
+              <w:pStyle w:val="Compact"/>
+            </w:pPr>
+            <w:r>
+              <w:t xml:space="preserve">Percepción de control externo, de Venkatesh y Bala (2008)</w:t>
+            </w:r>
+          </w:p>
+        </w:tc>
+      </w:tr>
+      <w:tr>
+        <w:tc>
+          <w:tcPr/>
+          <w:p>
+            <w:pPr>
+              <w:pStyle w:val="Compact"/>
+              <w:jc w:val="center"/>
+            </w:pPr>
+            <w:r>
+              <w:t xml:space="preserve">S1</w:t>
+            </w:r>
+          </w:p>
+        </w:tc>
+        <w:tc>
+          <w:tcPr/>
+          <w:p>
+            <w:pPr>
+              <w:pStyle w:val="Compact"/>
+            </w:pPr>
+            <w:r>
+              <w:rPr>
+                <w:i/>
+                <w:iCs/>
+              </w:rPr>
+              <w:t xml:space="preserve">People who influence my behavior think that I should use the system.</w:t>
+            </w:r>
+            <w:r>
+              <w:t xml:space="preserve"> </w:t>
+            </w:r>
+            <w:r>
+              <w:t xml:space="preserve">Referente concretado en los colegas</w:t>
+            </w:r>
+          </w:p>
+        </w:tc>
+      </w:tr>
+      <w:tr>
+        <w:tc>
+          <w:tcPr/>
+          <w:p>
+            <w:pPr>
+              <w:pStyle w:val="Compact"/>
+              <w:jc w:val="center"/>
+            </w:pPr>
+            <w:r>
+              <w:t xml:space="preserve">S2</w:t>
+            </w:r>
+          </w:p>
+        </w:tc>
+        <w:tc>
+          <w:tcPr/>
+          <w:p>
+            <w:pPr>
+              <w:pStyle w:val="Compact"/>
+            </w:pPr>
+            <w:r>
+              <w:rPr>
+                <w:i/>
+                <w:iCs/>
+              </w:rPr>
+              <w:t xml:space="preserve">People who are important to me think that I should use the system.</w:t>
+            </w:r>
+            <w:r>
+              <w:t xml:space="preserve"> </w:t>
+            </w:r>
+            <w:r>
+              <w:t xml:space="preserve">Referente concretado en las autoridades</w:t>
+            </w:r>
+          </w:p>
+        </w:tc>
+      </w:tr>
+      <w:tr>
+        <w:tc>
+          <w:tcPr/>
+          <w:p>
+            <w:pPr>
+              <w:pStyle w:val="Compact"/>
+              <w:jc w:val="center"/>
+            </w:pPr>
+            <w:r>
+              <w:t xml:space="preserve">I1</w:t>
+            </w:r>
+          </w:p>
+        </w:tc>
+        <w:tc>
+          <w:tcPr/>
+          <w:p>
+            <w:pPr>
+              <w:pStyle w:val="Compact"/>
+            </w:pPr>
+            <w:r>
+              <w:rPr>
+                <w:i/>
+                <w:iCs/>
+              </w:rPr>
+              <w:t xml:space="preserve">Assuming I have access to the system, I intend to use it.</w:t>
+            </w:r>
+          </w:p>
+        </w:tc>
+      </w:tr>
+      <w:tr>
+        <w:tc>
+          <w:tcPr/>
+          <w:p>
+            <w:pPr>
+              <w:pStyle w:val="Compact"/>
+              <w:jc w:val="center"/>
+            </w:pPr>
+            <w:r>
+              <w:t xml:space="preserve">I2</w:t>
+            </w:r>
+          </w:p>
+        </w:tc>
+        <w:tc>
+          <w:tcPr/>
+          <w:p>
+            <w:pPr>
+              <w:pStyle w:val="Compact"/>
+            </w:pPr>
+            <w:r>
+              <w:t xml:space="preserve">Adaptación propia (recomendación a colegas); no figura en TAM2</w:t>
+            </w:r>
+          </w:p>
+        </w:tc>
+      </w:tr>
+    </w:tbl>
     <w:p>
       <w:pPr>
         <w:pStyle w:val="BodyText"/>
@@ -1232,8 +2028,9 @@
         <w:t xml:space="preserve">, §1).</w:t>
       </w:r>
     </w:p>
-    <w:bookmarkEnd w:id="10"/>
-    <w:bookmarkStart w:id="11" w:name="cómo-se-analizarán-las-respuestas"/>
+    <w:bookmarkEnd w:id="11"/>
+    <w:bookmarkEnd w:id="12"/>
+    <w:bookmarkStart w:id="13" w:name="cómo-se-analizarán-las-respuestas"/>
     <w:p>
       <w:pPr>
         <w:pStyle w:val="Heading2"/>
@@ -1263,7 +2060,7 @@
           <w:b/>
           <w:bCs/>
         </w:rPr>
-        <w:t xml:space="preserve">Con un panel de seis especialistas esa estimación no es</w:t>
+        <w:t xml:space="preserve">Con un panel de cinco especialistas esa estimación no es</w:t>
       </w:r>
       <w:r>
         <w:rPr>
@@ -1377,8 +2174,8 @@
         <w:t xml:space="preserve">cuando su mediana sea igual o superior a 4.</w:t>
       </w:r>
     </w:p>
-    <w:bookmarkEnd w:id="11"/>
-    <w:bookmarkStart w:id="12" w:name="dónde-están-los-ítems-originales"/>
+    <w:bookmarkEnd w:id="13"/>
+    <w:bookmarkStart w:id="14" w:name="dónde-están-los-ítems-originales"/>
     <w:p>
       <w:pPr>
         <w:pStyle w:val="Heading2"/>
@@ -1569,8 +2366,8 @@
         <w:t xml:space="preserve">(Cronbach’s alpha).</w:t>
       </w:r>
     </w:p>
-    <w:bookmarkEnd w:id="12"/>
-    <w:bookmarkEnd w:id="13"/>
+    <w:bookmarkEnd w:id="14"/>
+    <w:bookmarkEnd w:id="15"/>
     <w:sectPr>
       <w:footnotePr>
         <w:numRestart w:val="eachSect"/>

</xml_diff>